<commit_message>
[doc] add gyro control for wrist
</commit_message>
<xml_diff>
--- a/software/test_scripts/XLeRobt JoyCon Control.docx
+++ b/software/test_scripts/XLeRobt JoyCon Control.docx
@@ -36,7 +36,7 @@
         <mc:AlternateContent>
           <mc:Choice Requires="wps">
             <w:drawing>
-              <wp:anchor distT="45720" distB="45720" distL="114300" distR="114300" simplePos="0" relativeHeight="251679744" behindDoc="0" locked="0" layoutInCell="1" allowOverlap="1" wp14:anchorId="339C7F9E" wp14:editId="5B8EDD35">
+              <wp:anchor distT="45720" distB="45720" distL="114300" distR="114300" simplePos="0" relativeHeight="251679744" behindDoc="0" locked="0" layoutInCell="1" allowOverlap="1" wp14:anchorId="339C7F9E" wp14:editId="18DEBA79">
                 <wp:simplePos x="0" y="0"/>
                 <wp:positionH relativeFrom="margin">
                   <wp:posOffset>4940300</wp:posOffset>
@@ -105,7 +105,30 @@
                                 <w:sz w:val="20"/>
                                 <w:szCs w:val="20"/>
                               </w:rPr>
-                              <w:t xml:space="preserve"> right elbow flex down</w:t>
+                              <w:t xml:space="preserve"> right </w:t>
+                            </w:r>
+                            <w:proofErr w:type="gramStart"/>
+                            <w:r>
+                              <w:rPr>
+                                <w:sz w:val="20"/>
+                                <w:szCs w:val="20"/>
+                              </w:rPr>
+                              <w:t>elbow</w:t>
+                            </w:r>
+                            <w:proofErr w:type="gramEnd"/>
+                            <w:r>
+                              <w:rPr>
+                                <w:sz w:val="20"/>
+                                <w:szCs w:val="20"/>
+                              </w:rPr>
+                              <w:t xml:space="preserve"> flex </w:t>
+                            </w:r>
+                            <w:r>
+                              <w:rPr>
+                                <w:sz w:val="20"/>
+                                <w:szCs w:val="20"/>
+                              </w:rPr>
+                              <w:t>up</w:t>
                             </w:r>
                             <w:r>
                               <w:rPr>
@@ -177,7 +200,30 @@
                           <w:sz w:val="20"/>
                           <w:szCs w:val="20"/>
                         </w:rPr>
-                        <w:t xml:space="preserve"> right elbow flex down</w:t>
+                        <w:t xml:space="preserve"> right </w:t>
+                      </w:r>
+                      <w:proofErr w:type="gramStart"/>
+                      <w:r>
+                        <w:rPr>
+                          <w:sz w:val="20"/>
+                          <w:szCs w:val="20"/>
+                        </w:rPr>
+                        <w:t>elbow</w:t>
+                      </w:r>
+                      <w:proofErr w:type="gramEnd"/>
+                      <w:r>
+                        <w:rPr>
+                          <w:sz w:val="20"/>
+                          <w:szCs w:val="20"/>
+                        </w:rPr>
+                        <w:t xml:space="preserve"> flex </w:t>
+                      </w:r>
+                      <w:r>
+                        <w:rPr>
+                          <w:sz w:val="20"/>
+                          <w:szCs w:val="20"/>
+                        </w:rPr>
+                        <w:t>up</w:t>
                       </w:r>
                       <w:r>
                         <w:rPr>
@@ -279,7 +325,30 @@
                                 <w:sz w:val="20"/>
                                 <w:szCs w:val="20"/>
                               </w:rPr>
-                              <w:t xml:space="preserve"> left elbow flex down</w:t>
+                              <w:t xml:space="preserve"> left </w:t>
+                            </w:r>
+                            <w:proofErr w:type="gramStart"/>
+                            <w:r>
+                              <w:rPr>
+                                <w:sz w:val="20"/>
+                                <w:szCs w:val="20"/>
+                              </w:rPr>
+                              <w:t>elbow</w:t>
+                            </w:r>
+                            <w:proofErr w:type="gramEnd"/>
+                            <w:r>
+                              <w:rPr>
+                                <w:sz w:val="20"/>
+                                <w:szCs w:val="20"/>
+                              </w:rPr>
+                              <w:t xml:space="preserve"> flex </w:t>
+                            </w:r>
+                            <w:r>
+                              <w:rPr>
+                                <w:sz w:val="20"/>
+                                <w:szCs w:val="20"/>
+                              </w:rPr>
+                              <w:t>up</w:t>
                             </w:r>
                             <w:r>
                               <w:rPr>
@@ -347,7 +416,30 @@
                           <w:sz w:val="20"/>
                           <w:szCs w:val="20"/>
                         </w:rPr>
-                        <w:t xml:space="preserve"> left elbow flex down</w:t>
+                        <w:t xml:space="preserve"> left </w:t>
+                      </w:r>
+                      <w:proofErr w:type="gramStart"/>
+                      <w:r>
+                        <w:rPr>
+                          <w:sz w:val="20"/>
+                          <w:szCs w:val="20"/>
+                        </w:rPr>
+                        <w:t>elbow</w:t>
+                      </w:r>
+                      <w:proofErr w:type="gramEnd"/>
+                      <w:r>
+                        <w:rPr>
+                          <w:sz w:val="20"/>
+                          <w:szCs w:val="20"/>
+                        </w:rPr>
+                        <w:t xml:space="preserve"> flex </w:t>
+                      </w:r>
+                      <w:r>
+                        <w:rPr>
+                          <w:sz w:val="20"/>
+                          <w:szCs w:val="20"/>
+                        </w:rPr>
+                        <w:t>up</w:t>
                       </w:r>
                       <w:r>
                         <w:rPr>
@@ -384,21 +476,81 @@
         <w:rPr>
           <w:noProof/>
         </w:rPr>
+        <w:drawing>
+          <wp:anchor distT="0" distB="0" distL="114300" distR="114300" simplePos="0" relativeHeight="251700224" behindDoc="0" locked="0" layoutInCell="1" allowOverlap="1" wp14:anchorId="37877461" wp14:editId="694F9754">
+            <wp:simplePos x="0" y="0"/>
+            <wp:positionH relativeFrom="margin">
+              <wp:posOffset>285750</wp:posOffset>
+            </wp:positionH>
+            <wp:positionV relativeFrom="paragraph">
+              <wp:posOffset>3982720</wp:posOffset>
+            </wp:positionV>
+            <wp:extent cx="2613674" cy="1892300"/>
+            <wp:effectExtent l="0" t="0" r="0" b="0"/>
+            <wp:wrapNone/>
+            <wp:docPr id="1473034147" name="Picture 21"/>
+            <wp:cNvGraphicFramePr>
+              <a:graphicFrameLocks xmlns:a="http://schemas.openxmlformats.org/drawingml/2006/main" noChangeAspect="1"/>
+            </wp:cNvGraphicFramePr>
+            <a:graphic xmlns:a="http://schemas.openxmlformats.org/drawingml/2006/main">
+              <a:graphicData uri="http://schemas.openxmlformats.org/drawingml/2006/picture">
+                <pic:pic xmlns:pic="http://schemas.openxmlformats.org/drawingml/2006/picture">
+                  <pic:nvPicPr>
+                    <pic:cNvPr id="1473034147" name="Picture 1473034147"/>
+                    <pic:cNvPicPr/>
+                  </pic:nvPicPr>
+                  <pic:blipFill>
+                    <a:blip r:embed="rId6" cstate="print">
+                      <a:extLst>
+                        <a:ext uri="{28A0092B-C50C-407E-A947-70E740481C1C}">
+                          <a14:useLocalDpi xmlns:a14="http://schemas.microsoft.com/office/drawing/2010/main" val="0"/>
+                        </a:ext>
+                      </a:extLst>
+                    </a:blip>
+                    <a:stretch>
+                      <a:fillRect/>
+                    </a:stretch>
+                  </pic:blipFill>
+                  <pic:spPr>
+                    <a:xfrm>
+                      <a:off x="0" y="0"/>
+                      <a:ext cx="2617672" cy="1895195"/>
+                    </a:xfrm>
+                    <a:prstGeom prst="rect">
+                      <a:avLst/>
+                    </a:prstGeom>
+                  </pic:spPr>
+                </pic:pic>
+              </a:graphicData>
+            </a:graphic>
+            <wp14:sizeRelH relativeFrom="margin">
+              <wp14:pctWidth>0</wp14:pctWidth>
+            </wp14:sizeRelH>
+            <wp14:sizeRelV relativeFrom="margin">
+              <wp14:pctHeight>0</wp14:pctHeight>
+            </wp14:sizeRelV>
+          </wp:anchor>
+        </w:drawing>
+      </w:r>
+      <w:r>
+        <w:rPr>
+          <w:noProof/>
+        </w:rPr>
         <mc:AlternateContent>
           <mc:Choice Requires="wps">
             <w:drawing>
-              <wp:anchor distT="45720" distB="45720" distL="114300" distR="114300" simplePos="0" relativeHeight="251677696" behindDoc="0" locked="0" layoutInCell="1" allowOverlap="1" wp14:anchorId="772CC85E" wp14:editId="276DF80B">
+              <wp:anchor distT="45720" distB="45720" distL="114300" distR="114300" simplePos="0" relativeHeight="251699200" behindDoc="0" locked="0" layoutInCell="1" allowOverlap="1" wp14:anchorId="3B5F0F5A" wp14:editId="7D73B133">
                 <wp:simplePos x="0" y="0"/>
                 <wp:positionH relativeFrom="margin">
-                  <wp:posOffset>7499350</wp:posOffset>
+                  <wp:posOffset>152400</wp:posOffset>
                 </wp:positionH>
-                <wp:positionV relativeFrom="page">
-                  <wp:posOffset>1765300</wp:posOffset>
+                <wp:positionV relativeFrom="paragraph">
+                  <wp:posOffset>3608070</wp:posOffset>
                 </wp:positionV>
-                <wp:extent cx="1638300" cy="298450"/>
-                <wp:effectExtent l="0" t="0" r="0" b="6350"/>
+                <wp:extent cx="2984500" cy="2317750"/>
+                <wp:effectExtent l="0" t="0" r="25400" b="25400"/>
                 <wp:wrapNone/>
-                <wp:docPr id="1264616436" name="Text Box 2"/>
+                <wp:docPr id="1626350987" name="Text Box 2"/>
                 <wp:cNvGraphicFramePr>
                   <a:graphicFrameLocks xmlns:a="http://schemas.openxmlformats.org/drawingml/2006/main"/>
                 </wp:cNvGraphicFramePr>
@@ -411,7 +563,7 @@
                       <wps:spPr bwMode="auto">
                         <a:xfrm>
                           <a:off x="0" y="0"/>
-                          <a:ext cx="1638300" cy="298450"/>
+                          <a:ext cx="2984500" cy="2317750"/>
                         </a:xfrm>
                         <a:prstGeom prst="rect">
                           <a:avLst/>
@@ -420,7 +572,9 @@
                           <a:srgbClr val="FFFFFF"/>
                         </a:solidFill>
                         <a:ln w="9525">
-                          <a:noFill/>
+                          <a:solidFill>
+                            <a:srgbClr val="000000"/>
+                          </a:solidFill>
                           <a:miter lim="800000"/>
                           <a:headEnd/>
                           <a:tailEnd/>
@@ -430,87 +584,10 @@
                         <w:txbxContent>
                           <w:p>
                             <w:pPr>
-                              <w:rPr>
-                                <w:sz w:val="20"/>
-                                <w:szCs w:val="20"/>
-                              </w:rPr>
+                              <w:jc w:val="center"/>
                             </w:pPr>
                             <w:r>
-                              <w:rPr>
-                                <w:b/>
-                                <w:bCs/>
-                                <w:sz w:val="20"/>
-                                <w:szCs w:val="20"/>
-                              </w:rPr>
-                              <w:t>R</w:t>
-                            </w:r>
-                            <w:r>
-                              <w:rPr>
-                                <w:sz w:val="20"/>
-                                <w:szCs w:val="20"/>
-                              </w:rPr>
-                              <w:t>:</w:t>
-                            </w:r>
-                            <w:r>
-                              <w:rPr>
-                                <w:sz w:val="20"/>
-                                <w:szCs w:val="20"/>
-                              </w:rPr>
-                              <w:t xml:space="preserve"> right elbow </w:t>
-                            </w:r>
-                            <w:proofErr w:type="gramStart"/>
-                            <w:r>
-                              <w:rPr>
-                                <w:sz w:val="20"/>
-                                <w:szCs w:val="20"/>
-                              </w:rPr>
-                              <w:t>flex</w:t>
-                            </w:r>
-                            <w:proofErr w:type="gramEnd"/>
-                            <w:r>
-                              <w:rPr>
-                                <w:sz w:val="20"/>
-                                <w:szCs w:val="20"/>
-                              </w:rPr>
-                              <w:t xml:space="preserve"> </w:t>
-                            </w:r>
-                            <w:proofErr w:type="gramStart"/>
-                            <w:r>
-                              <w:rPr>
-                                <w:sz w:val="20"/>
-                                <w:szCs w:val="20"/>
-                              </w:rPr>
-                              <w:t xml:space="preserve">up </w:t>
-                            </w:r>
-                            <w:r>
-                              <w:rPr>
-                                <w:sz w:val="20"/>
-                                <w:szCs w:val="20"/>
-                              </w:rPr>
-                              <w:t xml:space="preserve"> </w:t>
-                            </w:r>
-                            <w:r>
-                              <w:rPr>
-                                <w:rFonts w:ascii="Segoe UI Emoji" w:hAnsi="Segoe UI Emoji" w:cs="Segoe UI Emoji"/>
-                                <w:sz w:val="20"/>
-                                <w:szCs w:val="20"/>
-                              </w:rPr>
-                              <w:t>💪</w:t>
-                            </w:r>
-                            <w:proofErr w:type="gramEnd"/>
-                            <w:r>
-                              <w:rPr>
-                                <w:sz w:val="20"/>
-                                <w:szCs w:val="20"/>
-                              </w:rPr>
-                              <w:t xml:space="preserve"> </w:t>
-                            </w:r>
-                            <w:r>
-                              <w:rPr>
-                                <w:sz w:val="20"/>
-                                <w:szCs w:val="20"/>
-                              </w:rPr>
-                              <w:t>down</w:t>
+                              <w:t>Robot Wrist Control</w:t>
                             </w:r>
                           </w:p>
                         </w:txbxContent>
@@ -532,11 +609,159 @@
           </mc:Choice>
           <mc:Fallback>
             <w:pict>
-              <v:shape w14:anchorId="772CC85E" id="_x0000_s1028" type="#_x0000_t202" style="position:absolute;margin-left:590.5pt;margin-top:139pt;width:129pt;height:23.5pt;z-index:251677696;visibility:visible;mso-wrap-style:square;mso-width-percent:0;mso-height-percent:0;mso-wrap-distance-left:9pt;mso-wrap-distance-top:3.6pt;mso-wrap-distance-right:9pt;mso-wrap-distance-bottom:3.6pt;mso-position-horizontal:absolute;mso-position-horizontal-relative:margin;mso-position-vertical:absolute;mso-position-vertical-relative:page;mso-width-percent:0;mso-height-percent:0;mso-width-relative:margin;mso-height-relative:margin;v-text-anchor:top" o:gfxdata="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" stroked="f">
+              <v:shape w14:anchorId="3B5F0F5A" id="_x0000_s1028" type="#_x0000_t202" style="position:absolute;margin-left:12pt;margin-top:284.1pt;width:235pt;height:182.5pt;z-index:251699200;visibility:visible;mso-wrap-style:square;mso-width-percent:0;mso-height-percent:0;mso-wrap-distance-left:9pt;mso-wrap-distance-top:3.6pt;mso-wrap-distance-right:9pt;mso-wrap-distance-bottom:3.6pt;mso-position-horizontal:absolute;mso-position-horizontal-relative:margin;mso-position-vertical:absolute;mso-position-vertical-relative:text;mso-width-percent:0;mso-height-percent:0;mso-width-relative:margin;mso-height-relative:margin;v-text-anchor:top" o:gfxdata="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">
                 <v:textbox>
                   <w:txbxContent>
                     <w:p>
                       <w:pPr>
+                        <w:jc w:val="center"/>
+                      </w:pPr>
+                      <w:r>
+                        <w:t>Robot Wrist Control</w:t>
+                      </w:r>
+                    </w:p>
+                  </w:txbxContent>
+                </v:textbox>
+                <w10:wrap anchorx="margin"/>
+              </v:shape>
+            </w:pict>
+          </mc:Fallback>
+        </mc:AlternateContent>
+      </w:r>
+      <w:r>
+        <w:rPr>
+          <w:noProof/>
+        </w:rPr>
+        <mc:AlternateContent>
+          <mc:Choice Requires="wps">
+            <w:drawing>
+              <wp:anchor distT="45720" distB="45720" distL="114300" distR="114300" simplePos="0" relativeHeight="251681792" behindDoc="0" locked="0" layoutInCell="1" allowOverlap="1" wp14:anchorId="79E9D842" wp14:editId="7F2BF446">
+                <wp:simplePos x="0" y="0"/>
+                <wp:positionH relativeFrom="margin">
+                  <wp:posOffset>7524750</wp:posOffset>
+                </wp:positionH>
+                <wp:positionV relativeFrom="page">
+                  <wp:posOffset>2070100</wp:posOffset>
+                </wp:positionV>
+                <wp:extent cx="1670050" cy="298450"/>
+                <wp:effectExtent l="0" t="0" r="6350" b="6350"/>
+                <wp:wrapNone/>
+                <wp:docPr id="154062375" name="Text Box 2"/>
+                <wp:cNvGraphicFramePr>
+                  <a:graphicFrameLocks xmlns:a="http://schemas.openxmlformats.org/drawingml/2006/main"/>
+                </wp:cNvGraphicFramePr>
+                <a:graphic xmlns:a="http://schemas.openxmlformats.org/drawingml/2006/main">
+                  <a:graphicData uri="http://schemas.microsoft.com/office/word/2010/wordprocessingShape">
+                    <wps:wsp>
+                      <wps:cNvSpPr txBox="1">
+                        <a:spLocks noChangeArrowheads="1"/>
+                      </wps:cNvSpPr>
+                      <wps:spPr bwMode="auto">
+                        <a:xfrm>
+                          <a:off x="0" y="0"/>
+                          <a:ext cx="1670050" cy="298450"/>
+                        </a:xfrm>
+                        <a:prstGeom prst="rect">
+                          <a:avLst/>
+                        </a:prstGeom>
+                        <a:solidFill>
+                          <a:srgbClr val="FFFFFF"/>
+                        </a:solidFill>
+                        <a:ln w="9525">
+                          <a:noFill/>
+                          <a:miter lim="800000"/>
+                          <a:headEnd/>
+                          <a:tailEnd/>
+                        </a:ln>
+                      </wps:spPr>
+                      <wps:txbx>
+                        <w:txbxContent>
+                          <w:p>
+                            <w:pPr>
+                              <w:rPr>
+                                <w:sz w:val="20"/>
+                                <w:szCs w:val="20"/>
+                              </w:rPr>
+                            </w:pPr>
+                            <w:r>
+                              <w:rPr>
+                                <w:b/>
+                                <w:bCs/>
+                                <w:sz w:val="20"/>
+                                <w:szCs w:val="20"/>
+                              </w:rPr>
+                              <w:t>X</w:t>
+                            </w:r>
+                            <w:r>
+                              <w:rPr>
+                                <w:sz w:val="20"/>
+                                <w:szCs w:val="20"/>
+                              </w:rPr>
+                              <w:t>:</w:t>
+                            </w:r>
+                            <w:r>
+                              <w:rPr>
+                                <w:sz w:val="20"/>
+                                <w:szCs w:val="20"/>
+                              </w:rPr>
+                              <w:t xml:space="preserve"> right shoulder </w:t>
+                            </w:r>
+                            <w:proofErr w:type="gramStart"/>
+                            <w:r>
+                              <w:rPr>
+                                <w:sz w:val="20"/>
+                                <w:szCs w:val="20"/>
+                              </w:rPr>
+                              <w:t>lift</w:t>
+                            </w:r>
+                            <w:proofErr w:type="gramEnd"/>
+                            <w:r>
+                              <w:rPr>
+                                <w:sz w:val="20"/>
+                                <w:szCs w:val="20"/>
+                              </w:rPr>
+                              <w:t xml:space="preserve"> up</w:t>
+                            </w:r>
+                            <w:r>
+                              <w:rPr>
+                                <w:sz w:val="20"/>
+                                <w:szCs w:val="20"/>
+                              </w:rPr>
+                              <w:t xml:space="preserve"> </w:t>
+                            </w:r>
+                            <w:r>
+                              <w:rPr>
+                                <w:rFonts w:ascii="Segoe UI Emoji" w:hAnsi="Segoe UI Emoji" w:cs="Segoe UI Emoji"/>
+                                <w:sz w:val="20"/>
+                                <w:szCs w:val="20"/>
+                              </w:rPr>
+                              <w:t>🤷</w:t>
+                            </w:r>
+                          </w:p>
+                        </w:txbxContent>
+                      </wps:txbx>
+                      <wps:bodyPr rot="0" vert="horz" wrap="square" lIns="91440" tIns="45720" rIns="91440" bIns="45720" anchor="t" anchorCtr="0">
+                        <a:noAutofit/>
+                      </wps:bodyPr>
+                    </wps:wsp>
+                  </a:graphicData>
+                </a:graphic>
+                <wp14:sizeRelH relativeFrom="margin">
+                  <wp14:pctWidth>0</wp14:pctWidth>
+                </wp14:sizeRelH>
+                <wp14:sizeRelV relativeFrom="margin">
+                  <wp14:pctHeight>0</wp14:pctHeight>
+                </wp14:sizeRelV>
+              </wp:anchor>
+            </w:drawing>
+          </mc:Choice>
+          <mc:Fallback>
+            <w:pict>
+              <v:shape w14:anchorId="79E9D842" id="_x0000_s1029" type="#_x0000_t202" style="position:absolute;margin-left:592.5pt;margin-top:163pt;width:131.5pt;height:23.5pt;z-index:251681792;visibility:visible;mso-wrap-style:square;mso-width-percent:0;mso-height-percent:0;mso-wrap-distance-left:9pt;mso-wrap-distance-top:3.6pt;mso-wrap-distance-right:9pt;mso-wrap-distance-bottom:3.6pt;mso-position-horizontal:absolute;mso-position-horizontal-relative:margin;mso-position-vertical:absolute;mso-position-vertical-relative:page;mso-width-percent:0;mso-height-percent:0;mso-width-relative:margin;mso-height-relative:margin;v-text-anchor:top" o:gfxdata="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" stroked="f">
+                <v:textbox>
+                  <w:txbxContent>
+                    <w:p>
+                      <w:pPr>
                         <w:rPr>
                           <w:sz w:val="20"/>
                           <w:szCs w:val="20"/>
@@ -549,6 +774,213 @@
                           <w:sz w:val="20"/>
                           <w:szCs w:val="20"/>
                         </w:rPr>
+                        <w:t>X</w:t>
+                      </w:r>
+                      <w:r>
+                        <w:rPr>
+                          <w:sz w:val="20"/>
+                          <w:szCs w:val="20"/>
+                        </w:rPr>
+                        <w:t>:</w:t>
+                      </w:r>
+                      <w:r>
+                        <w:rPr>
+                          <w:sz w:val="20"/>
+                          <w:szCs w:val="20"/>
+                        </w:rPr>
+                        <w:t xml:space="preserve"> right shoulder </w:t>
+                      </w:r>
+                      <w:proofErr w:type="gramStart"/>
+                      <w:r>
+                        <w:rPr>
+                          <w:sz w:val="20"/>
+                          <w:szCs w:val="20"/>
+                        </w:rPr>
+                        <w:t>lift</w:t>
+                      </w:r>
+                      <w:proofErr w:type="gramEnd"/>
+                      <w:r>
+                        <w:rPr>
+                          <w:sz w:val="20"/>
+                          <w:szCs w:val="20"/>
+                        </w:rPr>
+                        <w:t xml:space="preserve"> up</w:t>
+                      </w:r>
+                      <w:r>
+                        <w:rPr>
+                          <w:sz w:val="20"/>
+                          <w:szCs w:val="20"/>
+                        </w:rPr>
+                        <w:t xml:space="preserve"> </w:t>
+                      </w:r>
+                      <w:r>
+                        <w:rPr>
+                          <w:rFonts w:ascii="Segoe UI Emoji" w:hAnsi="Segoe UI Emoji" w:cs="Segoe UI Emoji"/>
+                          <w:sz w:val="20"/>
+                          <w:szCs w:val="20"/>
+                        </w:rPr>
+                        <w:t>🤷</w:t>
+                      </w:r>
+                    </w:p>
+                  </w:txbxContent>
+                </v:textbox>
+                <w10:wrap anchorx="margin" anchory="page"/>
+              </v:shape>
+            </w:pict>
+          </mc:Fallback>
+        </mc:AlternateContent>
+      </w:r>
+      <w:r>
+        <w:rPr>
+          <w:noProof/>
+        </w:rPr>
+        <mc:AlternateContent>
+          <mc:Choice Requires="wps">
+            <w:drawing>
+              <wp:anchor distT="45720" distB="45720" distL="114300" distR="114300" simplePos="0" relativeHeight="251677696" behindDoc="0" locked="0" layoutInCell="1" allowOverlap="1" wp14:anchorId="772CC85E" wp14:editId="0E0D1329">
+                <wp:simplePos x="0" y="0"/>
+                <wp:positionH relativeFrom="margin">
+                  <wp:posOffset>7499350</wp:posOffset>
+                </wp:positionH>
+                <wp:positionV relativeFrom="page">
+                  <wp:posOffset>1765300</wp:posOffset>
+                </wp:positionV>
+                <wp:extent cx="1828800" cy="298450"/>
+                <wp:effectExtent l="0" t="0" r="0" b="6350"/>
+                <wp:wrapNone/>
+                <wp:docPr id="1264616436" name="Text Box 2"/>
+                <wp:cNvGraphicFramePr>
+                  <a:graphicFrameLocks xmlns:a="http://schemas.openxmlformats.org/drawingml/2006/main"/>
+                </wp:cNvGraphicFramePr>
+                <a:graphic xmlns:a="http://schemas.openxmlformats.org/drawingml/2006/main">
+                  <a:graphicData uri="http://schemas.microsoft.com/office/word/2010/wordprocessingShape">
+                    <wps:wsp>
+                      <wps:cNvSpPr txBox="1">
+                        <a:spLocks noChangeArrowheads="1"/>
+                      </wps:cNvSpPr>
+                      <wps:spPr bwMode="auto">
+                        <a:xfrm>
+                          <a:off x="0" y="0"/>
+                          <a:ext cx="1828800" cy="298450"/>
+                        </a:xfrm>
+                        <a:prstGeom prst="rect">
+                          <a:avLst/>
+                        </a:prstGeom>
+                        <a:solidFill>
+                          <a:srgbClr val="FFFFFF"/>
+                        </a:solidFill>
+                        <a:ln w="9525">
+                          <a:noFill/>
+                          <a:miter lim="800000"/>
+                          <a:headEnd/>
+                          <a:tailEnd/>
+                        </a:ln>
+                      </wps:spPr>
+                      <wps:txbx>
+                        <w:txbxContent>
+                          <w:p>
+                            <w:pPr>
+                              <w:rPr>
+                                <w:sz w:val="20"/>
+                                <w:szCs w:val="20"/>
+                              </w:rPr>
+                            </w:pPr>
+                            <w:r>
+                              <w:rPr>
+                                <w:b/>
+                                <w:bCs/>
+                                <w:sz w:val="20"/>
+                                <w:szCs w:val="20"/>
+                              </w:rPr>
+                              <w:t>R</w:t>
+                            </w:r>
+                            <w:r>
+                              <w:rPr>
+                                <w:sz w:val="20"/>
+                                <w:szCs w:val="20"/>
+                              </w:rPr>
+                              <w:t>:</w:t>
+                            </w:r>
+                            <w:r>
+                              <w:rPr>
+                                <w:sz w:val="20"/>
+                                <w:szCs w:val="20"/>
+                              </w:rPr>
+                              <w:t xml:space="preserve"> right elbow flex </w:t>
+                            </w:r>
+                            <w:r>
+                              <w:rPr>
+                                <w:sz w:val="20"/>
+                                <w:szCs w:val="20"/>
+                              </w:rPr>
+                              <w:t>down</w:t>
+                            </w:r>
+                            <w:r>
+                              <w:rPr>
+                                <w:sz w:val="20"/>
+                                <w:szCs w:val="20"/>
+                              </w:rPr>
+                              <w:t xml:space="preserve"> </w:t>
+                            </w:r>
+                            <w:r>
+                              <w:rPr>
+                                <w:rFonts w:ascii="Segoe UI Emoji" w:hAnsi="Segoe UI Emoji" w:cs="Segoe UI Emoji"/>
+                                <w:sz w:val="20"/>
+                                <w:szCs w:val="20"/>
+                              </w:rPr>
+                              <w:t>💪</w:t>
+                            </w:r>
+                            <w:r>
+                              <w:rPr>
+                                <w:sz w:val="20"/>
+                                <w:szCs w:val="20"/>
+                              </w:rPr>
+                              <w:t xml:space="preserve"> </w:t>
+                            </w:r>
+                            <w:r>
+                              <w:rPr>
+                                <w:sz w:val="20"/>
+                                <w:szCs w:val="20"/>
+                              </w:rPr>
+                              <w:t>down</w:t>
+                            </w:r>
+                          </w:p>
+                        </w:txbxContent>
+                      </wps:txbx>
+                      <wps:bodyPr rot="0" vert="horz" wrap="square" lIns="91440" tIns="45720" rIns="91440" bIns="45720" anchor="t" anchorCtr="0">
+                        <a:noAutofit/>
+                      </wps:bodyPr>
+                    </wps:wsp>
+                  </a:graphicData>
+                </a:graphic>
+                <wp14:sizeRelH relativeFrom="margin">
+                  <wp14:pctWidth>0</wp14:pctWidth>
+                </wp14:sizeRelH>
+                <wp14:sizeRelV relativeFrom="margin">
+                  <wp14:pctHeight>0</wp14:pctHeight>
+                </wp14:sizeRelV>
+              </wp:anchor>
+            </w:drawing>
+          </mc:Choice>
+          <mc:Fallback>
+            <w:pict>
+              <v:shape w14:anchorId="772CC85E" id="_x0000_s1030" type="#_x0000_t202" style="position:absolute;margin-left:590.5pt;margin-top:139pt;width:2in;height:23.5pt;z-index:251677696;visibility:visible;mso-wrap-style:square;mso-width-percent:0;mso-height-percent:0;mso-wrap-distance-left:9pt;mso-wrap-distance-top:3.6pt;mso-wrap-distance-right:9pt;mso-wrap-distance-bottom:3.6pt;mso-position-horizontal:absolute;mso-position-horizontal-relative:margin;mso-position-vertical:absolute;mso-position-vertical-relative:page;mso-width-percent:0;mso-height-percent:0;mso-width-relative:margin;mso-height-relative:margin;v-text-anchor:top" o:gfxdata="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" stroked="f">
+                <v:textbox>
+                  <w:txbxContent>
+                    <w:p>
+                      <w:pPr>
+                        <w:rPr>
+                          <w:sz w:val="20"/>
+                          <w:szCs w:val="20"/>
+                        </w:rPr>
+                      </w:pPr>
+                      <w:r>
+                        <w:rPr>
+                          <w:b/>
+                          <w:bCs/>
+                          <w:sz w:val="20"/>
+                          <w:szCs w:val="20"/>
+                        </w:rPr>
                         <w:t>R</w:t>
                       </w:r>
                       <w:r>
@@ -563,17 +995,15 @@
                           <w:sz w:val="20"/>
                           <w:szCs w:val="20"/>
                         </w:rPr>
-                        <w:t xml:space="preserve"> right elbow </w:t>
-                      </w:r>
-                      <w:proofErr w:type="gramStart"/>
-                      <w:r>
-                        <w:rPr>
-                          <w:sz w:val="20"/>
-                          <w:szCs w:val="20"/>
-                        </w:rPr>
-                        <w:t>flex</w:t>
-                      </w:r>
-                      <w:proofErr w:type="gramEnd"/>
+                        <w:t xml:space="preserve"> right elbow flex </w:t>
+                      </w:r>
+                      <w:r>
+                        <w:rPr>
+                          <w:sz w:val="20"/>
+                          <w:szCs w:val="20"/>
+                        </w:rPr>
+                        <w:t>down</w:t>
+                      </w:r>
                       <w:r>
                         <w:rPr>
                           <w:sz w:val="20"/>
@@ -581,21 +1011,6 @@
                         </w:rPr>
                         <w:t xml:space="preserve"> </w:t>
                       </w:r>
-                      <w:proofErr w:type="gramStart"/>
-                      <w:r>
-                        <w:rPr>
-                          <w:sz w:val="20"/>
-                          <w:szCs w:val="20"/>
-                        </w:rPr>
-                        <w:t xml:space="preserve">up </w:t>
-                      </w:r>
-                      <w:r>
-                        <w:rPr>
-                          <w:sz w:val="20"/>
-                          <w:szCs w:val="20"/>
-                        </w:rPr>
-                        <w:t xml:space="preserve"> </w:t>
-                      </w:r>
                       <w:r>
                         <w:rPr>
                           <w:rFonts w:ascii="Segoe UI Emoji" w:hAnsi="Segoe UI Emoji" w:cs="Segoe UI Emoji"/>
@@ -604,7 +1019,6 @@
                         </w:rPr>
                         <w:t>💪</w:t>
                       </w:r>
-                      <w:proofErr w:type="gramEnd"/>
                       <w:r>
                         <w:rPr>
                           <w:sz w:val="20"/>
@@ -704,23 +1118,14 @@
                                 <w:sz w:val="20"/>
                                 <w:szCs w:val="20"/>
                               </w:rPr>
-                              <w:t xml:space="preserve"> left elbow </w:t>
-                            </w:r>
-                            <w:proofErr w:type="gramStart"/>
-                            <w:r>
-                              <w:rPr>
-                                <w:sz w:val="20"/>
-                                <w:szCs w:val="20"/>
-                              </w:rPr>
-                              <w:t>flex</w:t>
-                            </w:r>
-                            <w:proofErr w:type="gramEnd"/>
-                            <w:r>
-                              <w:rPr>
-                                <w:sz w:val="20"/>
-                                <w:szCs w:val="20"/>
-                              </w:rPr>
-                              <w:t xml:space="preserve"> up</w:t>
+                              <w:t xml:space="preserve"> left elbow flex </w:t>
+                            </w:r>
+                            <w:r>
+                              <w:rPr>
+                                <w:sz w:val="20"/>
+                                <w:szCs w:val="20"/>
+                              </w:rPr>
+                              <w:t>down</w:t>
                             </w:r>
                             <w:r>
                               <w:rPr>
@@ -757,7 +1162,7 @@
           </mc:Choice>
           <mc:Fallback>
             <w:pict>
-              <v:shape w14:anchorId="0748B394" id="_x0000_s1029" type="#_x0000_t202" style="position:absolute;margin-left:20pt;margin-top:134pt;width:116pt;height:21pt;z-index:251661312;visibility:visible;mso-wrap-style:square;mso-width-percent:0;mso-height-percent:0;mso-wrap-distance-left:9pt;mso-wrap-distance-top:3.6pt;mso-wrap-distance-right:9pt;mso-wrap-distance-bottom:3.6pt;mso-position-horizontal:absolute;mso-position-horizontal-relative:margin;mso-position-vertical:absolute;mso-position-vertical-relative:page;mso-width-percent:0;mso-height-percent:0;mso-width-relative:margin;mso-height-relative:margin;v-text-anchor:top" o:gfxdata="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" stroked="f">
+              <v:shape w14:anchorId="0748B394" id="_x0000_s1031" type="#_x0000_t202" style="position:absolute;margin-left:20pt;margin-top:134pt;width:116pt;height:21pt;z-index:251661312;visibility:visible;mso-wrap-style:square;mso-width-percent:0;mso-height-percent:0;mso-wrap-distance-left:9pt;mso-wrap-distance-top:3.6pt;mso-wrap-distance-right:9pt;mso-wrap-distance-bottom:3.6pt;mso-position-horizontal:absolute;mso-position-horizontal-relative:margin;mso-position-vertical:absolute;mso-position-vertical-relative:page;mso-width-percent:0;mso-height-percent:0;mso-width-relative:margin;mso-height-relative:margin;v-text-anchor:top" o:gfxdata="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" stroked="f">
                 <v:textbox>
                   <w:txbxContent>
                     <w:p>
@@ -788,23 +1193,14 @@
                           <w:sz w:val="20"/>
                           <w:szCs w:val="20"/>
                         </w:rPr>
-                        <w:t xml:space="preserve"> left elbow </w:t>
-                      </w:r>
-                      <w:proofErr w:type="gramStart"/>
-                      <w:r>
-                        <w:rPr>
-                          <w:sz w:val="20"/>
-                          <w:szCs w:val="20"/>
-                        </w:rPr>
-                        <w:t>flex</w:t>
-                      </w:r>
-                      <w:proofErr w:type="gramEnd"/>
-                      <w:r>
-                        <w:rPr>
-                          <w:sz w:val="20"/>
-                          <w:szCs w:val="20"/>
-                        </w:rPr>
-                        <w:t xml:space="preserve"> up</w:t>
+                        <w:t xml:space="preserve"> left elbow flex </w:t>
+                      </w:r>
+                      <w:r>
+                        <w:rPr>
+                          <w:sz w:val="20"/>
+                          <w:szCs w:val="20"/>
+                        </w:rPr>
+                        <w:t>down</w:t>
                       </w:r>
                       <w:r>
                         <w:rPr>
@@ -837,7 +1233,7 @@
         <mc:AlternateContent>
           <mc:Choice Requires="wps">
             <w:drawing>
-              <wp:anchor distT="45720" distB="45720" distL="114300" distR="114300" simplePos="0" relativeHeight="251663360" behindDoc="0" locked="0" layoutInCell="1" allowOverlap="1" wp14:anchorId="5B8F41DA" wp14:editId="41EEA9DA">
+              <wp:anchor distT="45720" distB="45720" distL="114300" distR="114300" simplePos="0" relativeHeight="251663360" behindDoc="0" locked="0" layoutInCell="1" allowOverlap="1" wp14:anchorId="5B8F41DA" wp14:editId="6261C94D">
                 <wp:simplePos x="0" y="0"/>
                 <wp:positionH relativeFrom="margin">
                   <wp:posOffset>-63500</wp:posOffset>
@@ -943,7 +1339,7 @@
           </mc:Choice>
           <mc:Fallback>
             <w:pict>
-              <v:shape w14:anchorId="5B8F41DA" id="_x0000_s1030" type="#_x0000_t202" style="position:absolute;margin-left:-5pt;margin-top:302.5pt;width:134pt;height:24.5pt;z-index:251663360;visibility:visible;mso-wrap-style:square;mso-width-percent:0;mso-height-percent:0;mso-wrap-distance-left:9pt;mso-wrap-distance-top:3.6pt;mso-wrap-distance-right:9pt;mso-wrap-distance-bottom:3.6pt;mso-position-horizontal:absolute;mso-position-horizontal-relative:margin;mso-position-vertical:absolute;mso-position-vertical-relative:page;mso-width-percent:0;mso-height-percent:0;mso-width-relative:margin;mso-height-relative:margin;v-text-anchor:top" o:gfxdata="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" stroked="f">
+              <v:shape w14:anchorId="5B8F41DA" id="_x0000_s1032" type="#_x0000_t202" style="position:absolute;margin-left:-5pt;margin-top:302.5pt;width:134pt;height:24.5pt;z-index:251663360;visibility:visible;mso-wrap-style:square;mso-width-percent:0;mso-height-percent:0;mso-wrap-distance-left:9pt;mso-wrap-distance-top:3.6pt;mso-wrap-distance-right:9pt;mso-wrap-distance-bottom:3.6pt;mso-position-horizontal:absolute;mso-position-horizontal-relative:margin;mso-position-vertical:absolute;mso-position-vertical-relative:page;mso-width-percent:0;mso-height-percent:0;mso-width-relative:margin;mso-height-relative:margin;v-text-anchor:top" o:gfxdata="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" stroked="f">
                 <v:textbox>
                   <w:txbxContent>
                     <w:p>
@@ -990,208 +1386,6 @@
                           <w:szCs w:val="20"/>
                         </w:rPr>
                         <w:t>🔚</w:t>
-                      </w:r>
-                    </w:p>
-                  </w:txbxContent>
-                </v:textbox>
-                <w10:wrap anchorx="margin" anchory="page"/>
-              </v:shape>
-            </w:pict>
-          </mc:Fallback>
-        </mc:AlternateContent>
-      </w:r>
-      <w:r>
-        <w:rPr>
-          <w:noProof/>
-        </w:rPr>
-        <mc:AlternateContent>
-          <mc:Choice Requires="wps">
-            <w:drawing>
-              <wp:anchor distT="45720" distB="45720" distL="114300" distR="114300" simplePos="0" relativeHeight="251681792" behindDoc="0" locked="0" layoutInCell="1" allowOverlap="1" wp14:anchorId="79E9D842" wp14:editId="45D69B6F">
-                <wp:simplePos x="0" y="0"/>
-                <wp:positionH relativeFrom="margin">
-                  <wp:posOffset>7708900</wp:posOffset>
-                </wp:positionH>
-                <wp:positionV relativeFrom="page">
-                  <wp:posOffset>2044700</wp:posOffset>
-                </wp:positionV>
-                <wp:extent cx="1670050" cy="298450"/>
-                <wp:effectExtent l="0" t="0" r="6350" b="6350"/>
-                <wp:wrapNone/>
-                <wp:docPr id="154062375" name="Text Box 2"/>
-                <wp:cNvGraphicFramePr>
-                  <a:graphicFrameLocks xmlns:a="http://schemas.openxmlformats.org/drawingml/2006/main"/>
-                </wp:cNvGraphicFramePr>
-                <a:graphic xmlns:a="http://schemas.openxmlformats.org/drawingml/2006/main">
-                  <a:graphicData uri="http://schemas.microsoft.com/office/word/2010/wordprocessingShape">
-                    <wps:wsp>
-                      <wps:cNvSpPr txBox="1">
-                        <a:spLocks noChangeArrowheads="1"/>
-                      </wps:cNvSpPr>
-                      <wps:spPr bwMode="auto">
-                        <a:xfrm>
-                          <a:off x="0" y="0"/>
-                          <a:ext cx="1670050" cy="298450"/>
-                        </a:xfrm>
-                        <a:prstGeom prst="rect">
-                          <a:avLst/>
-                        </a:prstGeom>
-                        <a:solidFill>
-                          <a:srgbClr val="FFFFFF"/>
-                        </a:solidFill>
-                        <a:ln w="9525">
-                          <a:noFill/>
-                          <a:miter lim="800000"/>
-                          <a:headEnd/>
-                          <a:tailEnd/>
-                        </a:ln>
-                      </wps:spPr>
-                      <wps:txbx>
-                        <w:txbxContent>
-                          <w:p>
-                            <w:pPr>
-                              <w:rPr>
-                                <w:sz w:val="20"/>
-                                <w:szCs w:val="20"/>
-                              </w:rPr>
-                            </w:pPr>
-                            <w:r>
-                              <w:rPr>
-                                <w:b/>
-                                <w:bCs/>
-                                <w:sz w:val="20"/>
-                                <w:szCs w:val="20"/>
-                              </w:rPr>
-                              <w:t>X</w:t>
-                            </w:r>
-                            <w:r>
-                              <w:rPr>
-                                <w:sz w:val="20"/>
-                                <w:szCs w:val="20"/>
-                              </w:rPr>
-                              <w:t>:</w:t>
-                            </w:r>
-                            <w:r>
-                              <w:rPr>
-                                <w:sz w:val="20"/>
-                                <w:szCs w:val="20"/>
-                              </w:rPr>
-                              <w:t xml:space="preserve"> right shoulder </w:t>
-                            </w:r>
-                            <w:proofErr w:type="gramStart"/>
-                            <w:r>
-                              <w:rPr>
-                                <w:sz w:val="20"/>
-                                <w:szCs w:val="20"/>
-                              </w:rPr>
-                              <w:t>lift</w:t>
-                            </w:r>
-                            <w:proofErr w:type="gramEnd"/>
-                            <w:r>
-                              <w:rPr>
-                                <w:sz w:val="20"/>
-                                <w:szCs w:val="20"/>
-                              </w:rPr>
-                              <w:t xml:space="preserve"> up</w:t>
-                            </w:r>
-                            <w:r>
-                              <w:rPr>
-                                <w:sz w:val="20"/>
-                                <w:szCs w:val="20"/>
-                              </w:rPr>
-                              <w:t xml:space="preserve"> </w:t>
-                            </w:r>
-                            <w:r>
-                              <w:rPr>
-                                <w:rFonts w:ascii="Segoe UI Emoji" w:hAnsi="Segoe UI Emoji" w:cs="Segoe UI Emoji"/>
-                                <w:sz w:val="20"/>
-                                <w:szCs w:val="20"/>
-                              </w:rPr>
-                              <w:t>🤷</w:t>
-                            </w:r>
-                          </w:p>
-                        </w:txbxContent>
-                      </wps:txbx>
-                      <wps:bodyPr rot="0" vert="horz" wrap="square" lIns="91440" tIns="45720" rIns="91440" bIns="45720" anchor="t" anchorCtr="0">
-                        <a:noAutofit/>
-                      </wps:bodyPr>
-                    </wps:wsp>
-                  </a:graphicData>
-                </a:graphic>
-                <wp14:sizeRelH relativeFrom="margin">
-                  <wp14:pctWidth>0</wp14:pctWidth>
-                </wp14:sizeRelH>
-                <wp14:sizeRelV relativeFrom="margin">
-                  <wp14:pctHeight>0</wp14:pctHeight>
-                </wp14:sizeRelV>
-              </wp:anchor>
-            </w:drawing>
-          </mc:Choice>
-          <mc:Fallback>
-            <w:pict>
-              <v:shape w14:anchorId="79E9D842" id="_x0000_s1031" type="#_x0000_t202" style="position:absolute;margin-left:607pt;margin-top:161pt;width:131.5pt;height:23.5pt;z-index:251681792;visibility:visible;mso-wrap-style:square;mso-width-percent:0;mso-height-percent:0;mso-wrap-distance-left:9pt;mso-wrap-distance-top:3.6pt;mso-wrap-distance-right:9pt;mso-wrap-distance-bottom:3.6pt;mso-position-horizontal:absolute;mso-position-horizontal-relative:margin;mso-position-vertical:absolute;mso-position-vertical-relative:page;mso-width-percent:0;mso-height-percent:0;mso-width-relative:margin;mso-height-relative:margin;v-text-anchor:top" o:gfxdata="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" stroked="f">
-                <v:textbox>
-                  <w:txbxContent>
-                    <w:p>
-                      <w:pPr>
-                        <w:rPr>
-                          <w:sz w:val="20"/>
-                          <w:szCs w:val="20"/>
-                        </w:rPr>
-                      </w:pPr>
-                      <w:r>
-                        <w:rPr>
-                          <w:b/>
-                          <w:bCs/>
-                          <w:sz w:val="20"/>
-                          <w:szCs w:val="20"/>
-                        </w:rPr>
-                        <w:t>X</w:t>
-                      </w:r>
-                      <w:r>
-                        <w:rPr>
-                          <w:sz w:val="20"/>
-                          <w:szCs w:val="20"/>
-                        </w:rPr>
-                        <w:t>:</w:t>
-                      </w:r>
-                      <w:r>
-                        <w:rPr>
-                          <w:sz w:val="20"/>
-                          <w:szCs w:val="20"/>
-                        </w:rPr>
-                        <w:t xml:space="preserve"> right shoulder </w:t>
-                      </w:r>
-                      <w:proofErr w:type="gramStart"/>
-                      <w:r>
-                        <w:rPr>
-                          <w:sz w:val="20"/>
-                          <w:szCs w:val="20"/>
-                        </w:rPr>
-                        <w:t>lift</w:t>
-                      </w:r>
-                      <w:proofErr w:type="gramEnd"/>
-                      <w:r>
-                        <w:rPr>
-                          <w:sz w:val="20"/>
-                          <w:szCs w:val="20"/>
-                        </w:rPr>
-                        <w:t xml:space="preserve"> up</w:t>
-                      </w:r>
-                      <w:r>
-                        <w:rPr>
-                          <w:sz w:val="20"/>
-                          <w:szCs w:val="20"/>
-                        </w:rPr>
-                        <w:t xml:space="preserve"> </w:t>
-                      </w:r>
-                      <w:r>
-                        <w:rPr>
-                          <w:rFonts w:ascii="Segoe UI Emoji" w:hAnsi="Segoe UI Emoji" w:cs="Segoe UI Emoji"/>
-                          <w:sz w:val="20"/>
-                          <w:szCs w:val="20"/>
-                        </w:rPr>
-                        <w:t>🤷</w:t>
                       </w:r>
                     </w:p>
                   </w:txbxContent>
@@ -1279,14 +1473,7 @@
                                 <w:sz w:val="20"/>
                                 <w:szCs w:val="20"/>
                               </w:rPr>
-                              <w:t xml:space="preserve"> </w:t>
-                            </w:r>
-                            <w:r>
-                              <w:rPr>
-                                <w:sz w:val="20"/>
-                                <w:szCs w:val="20"/>
-                              </w:rPr>
-                              <w:t xml:space="preserve"> (</w:t>
+                              <w:t xml:space="preserve">  (</w:t>
                             </w:r>
                             <w:proofErr w:type="gramEnd"/>
                             <w:r>
@@ -1294,21 +1481,7 @@
                                 <w:sz w:val="20"/>
                                 <w:szCs w:val="20"/>
                               </w:rPr>
-                              <w:t xml:space="preserve">hold) </w:t>
-                            </w:r>
-                            <w:r>
-                              <w:rPr>
-                                <w:sz w:val="20"/>
-                                <w:szCs w:val="20"/>
-                              </w:rPr>
-                              <w:t>right</w:t>
-                            </w:r>
-                            <w:r>
-                              <w:rPr>
-                                <w:sz w:val="20"/>
-                                <w:szCs w:val="20"/>
-                              </w:rPr>
-                              <w:t xml:space="preserve"> gri</w:t>
+                              <w:t>hold) right gri</w:t>
                             </w:r>
                             <w:r>
                               <w:rPr>
@@ -1913,14 +2086,7 @@
                                 <w:sz w:val="18"/>
                                 <w:szCs w:val="18"/>
                               </w:rPr>
-                              <w:t>:</w:t>
-                            </w:r>
-                            <w:r>
-                              <w:rPr>
-                                <w:sz w:val="18"/>
-                                <w:szCs w:val="18"/>
-                              </w:rPr>
-                              <w:t xml:space="preserve"> base Control</w:t>
+                              <w:t>: base Control</w:t>
                             </w:r>
                             <w:r>
                               <w:rPr>
@@ -2460,16 +2626,7 @@
                                 <w:sz w:val="18"/>
                                 <w:szCs w:val="18"/>
                               </w:rPr>
-                              <w:t>S</w:t>
-                            </w:r>
-                            <w:r>
-                              <w:rPr>
-                                <w:b/>
-                                <w:bCs/>
-                                <w:sz w:val="18"/>
-                                <w:szCs w:val="18"/>
-                              </w:rPr>
-                              <w:t>L</w:t>
+                              <w:t>SL</w:t>
                             </w:r>
                             <w:r>
                               <w:rPr>
@@ -3387,14 +3544,7 @@
                                 <w:sz w:val="20"/>
                                 <w:szCs w:val="20"/>
                               </w:rPr>
-                              <w:t xml:space="preserve">: </w:t>
-                            </w:r>
-                            <w:r>
-                              <w:rPr>
-                                <w:sz w:val="20"/>
-                                <w:szCs w:val="20"/>
-                              </w:rPr>
-                              <w:t xml:space="preserve">left </w:t>
+                              <w:t xml:space="preserve">: left </w:t>
                             </w:r>
                             <w:r>
                               <w:rPr>
@@ -3633,7 +3783,7 @@
         <mc:AlternateContent>
           <mc:Choice Requires="wps">
             <w:drawing>
-              <wp:anchor distT="45720" distB="45720" distL="114300" distR="114300" simplePos="0" relativeHeight="251669504" behindDoc="0" locked="0" layoutInCell="1" allowOverlap="1" wp14:anchorId="7FA695F3" wp14:editId="599B32DC">
+              <wp:anchor distT="45720" distB="45720" distL="114300" distR="114300" simplePos="0" relativeHeight="251669504" behindDoc="0" locked="0" layoutInCell="1" allowOverlap="1" wp14:anchorId="7FA695F3" wp14:editId="2551884C">
                 <wp:simplePos x="0" y="0"/>
                 <wp:positionH relativeFrom="margin">
                   <wp:posOffset>4060825</wp:posOffset>
@@ -3772,7 +3922,7 @@
                     <pic:cNvPicPr/>
                   </pic:nvPicPr>
                   <pic:blipFill>
-                    <a:blip r:embed="rId6">
+                    <a:blip r:embed="rId7">
                       <a:extLst>
                         <a:ext uri="{28A0092B-C50C-407E-A947-70E740481C1C}">
                           <a14:useLocalDpi xmlns:a14="http://schemas.microsoft.com/office/drawing/2010/main" val="0"/>
@@ -3799,6 +3949,7 @@
         </w:drawing>
       </w:r>
     </w:p>
+    <w:p/>
     <w:p/>
     <w:p/>
     <w:sectPr>
@@ -4465,6 +4616,7 @@
   <w:style w:type="character" w:default="1" w:styleId="DefaultParagraphFont">
     <w:name w:val="Default Paragraph Font"/>
     <w:uiPriority w:val="1"/>
+    <w:semiHidden/>
     <w:unhideWhenUsed/>
   </w:style>
   <w:style w:type="table" w:default="1" w:styleId="TableNormal">

</xml_diff>